<commit_message>
[+] Add a part of adaptation
</commit_message>
<xml_diff>
--- a/Этапы.docx
+++ b/Этапы.docx
@@ -309,26 +309,7 @@
         <w:pStyle w:val="1"/>
       </w:pPr>
       <w:r>
-        <w:t>Структура страницы</w:t>
-      </w:r>
-    </w:p>
-    <w:p>
-      <w:pPr>
-        <w:pStyle w:val="2"/>
-        <w:rPr>
-          <w:sz w:val="36"/>
-        </w:rPr>
-      </w:pPr>
-      <w:r>
-        <w:t>1. Первый экран (</w:t>
-      </w:r>
-      <w:proofErr w:type="spellStart"/>
-      <w:r>
-        <w:t>Hero</w:t>
-      </w:r>
-      <w:proofErr w:type="spellEnd"/>
-      <w:r>
-        <w:t>)</w:t>
+        <w:t>Уточнить:</w:t>
       </w:r>
     </w:p>
     <w:p>
@@ -336,16 +317,11 @@
         <w:pStyle w:val="a3"/>
         <w:numPr>
           <w:ilvl w:val="0"/>
-          <w:numId w:val="15"/>
+          <w:numId w:val="28"/>
         </w:numPr>
       </w:pPr>
       <w:r>
-        <w:t>Заголовок:</w:t>
-      </w:r>
-    </w:p>
-    <w:p>
-      <w:r>
-        <w:t>Реставрация исторических зданий в Санкт-Петербурге</w:t>
+        <w:t>С какого года работают?</w:t>
       </w:r>
     </w:p>
     <w:p>
@@ -353,16 +329,11 @@
         <w:pStyle w:val="a3"/>
         <w:numPr>
           <w:ilvl w:val="0"/>
-          <w:numId w:val="15"/>
+          <w:numId w:val="28"/>
         </w:numPr>
       </w:pPr>
       <w:r>
-        <w:t>Подзаголовок:</w:t>
-      </w:r>
-    </w:p>
-    <w:p>
-      <w:r>
-        <w:t>Опыт более X лет. Работаем с объектами под охраной государства</w:t>
+        <w:t>В каком году какое здание делали?</w:t>
       </w:r>
     </w:p>
     <w:p>
@@ -370,384 +341,24 @@
         <w:pStyle w:val="a3"/>
         <w:numPr>
           <w:ilvl w:val="0"/>
-          <w:numId w:val="15"/>
+          <w:numId w:val="28"/>
         </w:numPr>
       </w:pPr>
       <w:r>
-        <w:t>Кнопка:</w:t>
-      </w:r>
-    </w:p>
-    <w:p>
-      <w:r>
-        <w:t>Оставить заявку / Связаться</w:t>
-      </w:r>
-    </w:p>
-    <w:p>
-      <w:pPr>
-        <w:pStyle w:val="a3"/>
-        <w:numPr>
-          <w:ilvl w:val="0"/>
-          <w:numId w:val="15"/>
-        </w:numPr>
-      </w:pPr>
-      <w:r>
-        <w:t>Фон:</w:t>
-      </w:r>
-      <w:r>
-        <w:br/>
-        <w:t xml:space="preserve">фото здания (желательно реального объекта) </w:t>
-      </w:r>
-    </w:p>
-    <w:p/>
-    <w:p>
-      <w:pPr>
-        <w:pStyle w:val="2"/>
-      </w:pPr>
-      <w:r>
-        <w:lastRenderedPageBreak/>
-        <w:t>2. О компании</w:t>
-      </w:r>
-    </w:p>
-    <w:p>
-      <w:pPr>
-        <w:pStyle w:val="a3"/>
-        <w:numPr>
-          <w:ilvl w:val="0"/>
-          <w:numId w:val="15"/>
-        </w:numPr>
-      </w:pPr>
-      <w:r>
-        <w:t xml:space="preserve">кто они </w:t>
-      </w:r>
-    </w:p>
-    <w:p>
-      <w:pPr>
-        <w:pStyle w:val="a3"/>
-        <w:numPr>
-          <w:ilvl w:val="0"/>
-          <w:numId w:val="15"/>
-        </w:numPr>
-      </w:pPr>
-      <w:r>
-        <w:t xml:space="preserve">сколько лет </w:t>
-      </w:r>
-    </w:p>
-    <w:p>
-      <w:pPr>
-        <w:pStyle w:val="a3"/>
-        <w:numPr>
-          <w:ilvl w:val="0"/>
-          <w:numId w:val="15"/>
-        </w:numPr>
-      </w:pPr>
-      <w:r>
-        <w:t xml:space="preserve">чем отличаются </w:t>
-      </w:r>
-    </w:p>
-    <w:p>
-      <w:r>
-        <w:t>упор:</w:t>
-      </w:r>
-    </w:p>
-    <w:p>
-      <w:r>
-        <w:t xml:space="preserve">опыт </w:t>
-      </w:r>
-    </w:p>
-    <w:p>
-      <w:r>
-        <w:t xml:space="preserve">надёжность </w:t>
-      </w:r>
-    </w:p>
-    <w:p>
-      <w:r>
-        <w:t xml:space="preserve">работа с серьёзными объектами </w:t>
-      </w:r>
-    </w:p>
-    <w:p/>
-    <w:p>
-      <w:pPr>
-        <w:pStyle w:val="2"/>
-      </w:pPr>
-      <w:r>
-        <w:t>3. Услуги</w:t>
-      </w:r>
-    </w:p>
-    <w:p>
-      <w:proofErr w:type="gramStart"/>
-      <w:r>
-        <w:t>Например</w:t>
-      </w:r>
-      <w:proofErr w:type="gramEnd"/>
-      <w:r>
-        <w:t>:</w:t>
-      </w:r>
-    </w:p>
-    <w:p>
-      <w:pPr>
-        <w:pStyle w:val="a3"/>
-        <w:numPr>
-          <w:ilvl w:val="0"/>
-          <w:numId w:val="16"/>
-        </w:numPr>
-      </w:pPr>
-      <w:r>
-        <w:t xml:space="preserve">реставрация фасадов </w:t>
-      </w:r>
-    </w:p>
-    <w:p>
-      <w:pPr>
-        <w:pStyle w:val="a3"/>
-        <w:numPr>
-          <w:ilvl w:val="0"/>
-          <w:numId w:val="16"/>
-        </w:numPr>
-      </w:pPr>
-      <w:r>
-        <w:t xml:space="preserve">капитальный ремонт </w:t>
-      </w:r>
-    </w:p>
-    <w:p>
-      <w:pPr>
-        <w:pStyle w:val="a3"/>
-        <w:numPr>
-          <w:ilvl w:val="0"/>
-          <w:numId w:val="16"/>
-        </w:numPr>
-      </w:pPr>
-      <w:r>
-        <w:t xml:space="preserve">работа с историческими объектами </w:t>
-      </w:r>
-    </w:p>
-    <w:p/>
-    <w:p>
-      <w:pPr>
-        <w:pStyle w:val="2"/>
-      </w:pPr>
-      <w:r>
-        <w:t>4. Кейсы (самое сильное место)</w:t>
-      </w:r>
-    </w:p>
-    <w:p>
-      <w:r>
-        <w:t>Вот тут твои адреса:</w:t>
-      </w:r>
-    </w:p>
-    <w:p>
-      <w:r>
-        <w:t xml:space="preserve">Миллионная, 20 </w:t>
-      </w:r>
-    </w:p>
-    <w:p>
-      <w:r>
-        <w:t xml:space="preserve">Жуковского, 37 </w:t>
-      </w:r>
-    </w:p>
-    <w:p>
-      <w:r>
-        <w:t xml:space="preserve">и т.д. </w:t>
-      </w:r>
-    </w:p>
-    <w:p>
-      <w:r>
-        <w:t>Для каждого:</w:t>
-      </w:r>
-    </w:p>
-    <w:p>
-      <w:pPr>
-        <w:pStyle w:val="a3"/>
-        <w:numPr>
-          <w:ilvl w:val="0"/>
-          <w:numId w:val="17"/>
-        </w:numPr>
-      </w:pPr>
-      <w:r>
-        <w:t xml:space="preserve">фото ДО / ПОСЛЕ </w:t>
-      </w:r>
-    </w:p>
-    <w:p>
-      <w:pPr>
-        <w:pStyle w:val="a3"/>
-        <w:numPr>
-          <w:ilvl w:val="0"/>
-          <w:numId w:val="17"/>
-        </w:numPr>
-      </w:pPr>
-      <w:r>
-        <w:t xml:space="preserve">короткое описание </w:t>
-      </w:r>
-    </w:p>
-    <w:p/>
-    <w:p>
-      <w:pPr>
-        <w:pStyle w:val="2"/>
-      </w:pPr>
-      <w:r>
-        <w:t>5. Почему им доверяют</w:t>
-      </w:r>
-    </w:p>
-    <w:p>
-      <w:pPr>
-        <w:pStyle w:val="a3"/>
-        <w:numPr>
-          <w:ilvl w:val="0"/>
-          <w:numId w:val="18"/>
-        </w:numPr>
-      </w:pPr>
-      <w:r>
-        <w:t xml:space="preserve">опыт X лет </w:t>
-      </w:r>
-    </w:p>
-    <w:p>
-      <w:pPr>
-        <w:pStyle w:val="a3"/>
-        <w:numPr>
-          <w:ilvl w:val="0"/>
-          <w:numId w:val="18"/>
-        </w:numPr>
-      </w:pPr>
-      <w:r>
-        <w:t xml:space="preserve">лицензии / допуски </w:t>
-      </w:r>
-    </w:p>
-    <w:p>
-      <w:pPr>
-        <w:pStyle w:val="a3"/>
-        <w:numPr>
-          <w:ilvl w:val="0"/>
-          <w:numId w:val="18"/>
-        </w:numPr>
-      </w:pPr>
-      <w:r>
-        <w:t xml:space="preserve">работа с ЮНЕСКО (если подтвердится — очень мощно) </w:t>
-      </w:r>
-    </w:p>
-    <w:p/>
-    <w:p>
-      <w:pPr>
-        <w:pStyle w:val="2"/>
-      </w:pPr>
-      <w:r>
-        <w:t>6. Процесс работы</w:t>
-      </w:r>
-      <w:r>
-        <w:t>?</w:t>
-      </w:r>
-    </w:p>
-    <w:p>
-      <w:pPr>
-        <w:pStyle w:val="a3"/>
-        <w:numPr>
-          <w:ilvl w:val="0"/>
-          <w:numId w:val="19"/>
-        </w:numPr>
-      </w:pPr>
-      <w:r>
-        <w:t xml:space="preserve">Осмотр объекта </w:t>
-      </w:r>
-    </w:p>
-    <w:p>
-      <w:pPr>
-        <w:pStyle w:val="a3"/>
-        <w:numPr>
-          <w:ilvl w:val="0"/>
-          <w:numId w:val="19"/>
-        </w:numPr>
-      </w:pPr>
-      <w:r>
-        <w:t xml:space="preserve">Проектирование </w:t>
-      </w:r>
-    </w:p>
-    <w:p>
-      <w:pPr>
-        <w:pStyle w:val="a3"/>
-        <w:numPr>
-          <w:ilvl w:val="0"/>
-          <w:numId w:val="19"/>
-        </w:numPr>
-      </w:pPr>
-      <w:r>
-        <w:t xml:space="preserve">Реставрация </w:t>
-      </w:r>
-    </w:p>
-    <w:p>
-      <w:pPr>
-        <w:pStyle w:val="a3"/>
-        <w:numPr>
-          <w:ilvl w:val="0"/>
-          <w:numId w:val="19"/>
-        </w:numPr>
-      </w:pPr>
-      <w:r>
-        <w:t xml:space="preserve">Сдача </w:t>
-      </w:r>
-    </w:p>
-    <w:p/>
-    <w:p>
-      <w:pPr>
-        <w:pStyle w:val="2"/>
-      </w:pPr>
-      <w:r>
-        <w:lastRenderedPageBreak/>
-        <w:t>7. Контакты</w:t>
-      </w:r>
-    </w:p>
-    <w:p>
-      <w:pPr>
-        <w:pStyle w:val="a3"/>
-        <w:numPr>
-          <w:ilvl w:val="0"/>
-          <w:numId w:val="20"/>
-        </w:numPr>
-      </w:pPr>
-      <w:r>
-        <w:t xml:space="preserve">телефон </w:t>
-      </w:r>
-    </w:p>
-    <w:p>
-      <w:pPr>
-        <w:pStyle w:val="a3"/>
-        <w:numPr>
-          <w:ilvl w:val="0"/>
-          <w:numId w:val="20"/>
-        </w:numPr>
-      </w:pPr>
-      <w:r>
-        <w:t xml:space="preserve">почта </w:t>
-      </w:r>
-    </w:p>
-    <w:p>
-      <w:pPr>
-        <w:pStyle w:val="a3"/>
-        <w:numPr>
-          <w:ilvl w:val="0"/>
-          <w:numId w:val="20"/>
-        </w:numPr>
-      </w:pPr>
-      <w:r>
-        <w:t>кнопка</w:t>
-      </w:r>
-    </w:p>
-    <w:p>
-      <w:pPr>
-        <w:pStyle w:val="a3"/>
-        <w:numPr>
-          <w:ilvl w:val="0"/>
-          <w:numId w:val="20"/>
-        </w:numPr>
-      </w:pPr>
-      <w:r>
-        <w:t>связаться с нами</w:t>
-      </w:r>
-      <w:r>
-        <w:t xml:space="preserve"> </w:t>
-      </w:r>
-    </w:p>
-    <w:p/>
-    <w:p>
+        <w:t>Есть ли гарантия на работу? На какой срок?</w:t>
+      </w:r>
+    </w:p>
+    <w:p>
+      <w:pPr>
+        <w:rPr>
+          <w:lang w:val="en-US"/>
+        </w:rPr>
+      </w:pPr>
       <w:r>
         <w:br w:type="page"/>
       </w:r>
+      <w:bookmarkStart w:id="0" w:name="_GoBack"/>
+      <w:bookmarkEnd w:id="0"/>
     </w:p>
     <w:p>
       <w:pPr>
@@ -805,22 +416,14 @@
           <w:lang w:val="en-US"/>
         </w:rPr>
       </w:pPr>
-      <w:proofErr w:type="spellStart"/>
       <w:r>
         <w:rPr>
           <w:lang w:val="en-US"/>
         </w:rPr>
-        <w:t>Nav</w:t>
-      </w:r>
-      <w:proofErr w:type="spellEnd"/>
-      <w:r>
-        <w:rPr>
-          <w:lang w:val="en-US"/>
-        </w:rPr>
-        <w:t xml:space="preserve"> </w:t>
-      </w:r>
-      <w:r>
-        <w:t>сделать более узким</w:t>
+        <w:t>Hero</w:t>
+      </w:r>
+      <w:r>
+        <w:t>: уменьшить заголовок</w:t>
       </w:r>
     </w:p>
     <w:p>
@@ -830,42 +433,18 @@
           <w:ilvl w:val="0"/>
           <w:numId w:val="21"/>
         </w:numPr>
-        <w:rPr>
-          <w:lang w:val="en-US"/>
-        </w:rPr>
-      </w:pPr>
-      <w:r>
-        <w:t>Текст более жирным</w:t>
-      </w:r>
-    </w:p>
-    <w:p>
-      <w:pPr>
-        <w:pStyle w:val="a3"/>
-        <w:numPr>
-          <w:ilvl w:val="0"/>
-          <w:numId w:val="21"/>
-        </w:numPr>
-        <w:rPr>
-          <w:lang w:val="en-US"/>
-        </w:rPr>
-      </w:pPr>
-      <w:r>
-        <w:rPr>
-          <w:lang w:val="en-US"/>
-        </w:rPr>
-        <w:t xml:space="preserve">Hero </w:t>
-      </w:r>
-      <w:r>
-        <w:t>в размер экрана</w:t>
-      </w:r>
-    </w:p>
-    <w:p>
-      <w:pPr>
-        <w:rPr>
-          <w:lang w:val="en-US"/>
-        </w:rPr>
-      </w:pPr>
-    </w:p>
+      </w:pPr>
+      <w:r>
+        <w:t>Добавить больше фото + до</w:t>
+      </w:r>
+      <w:r>
+        <w:t>/</w:t>
+      </w:r>
+      <w:r>
+        <w:t>после</w:t>
+      </w:r>
+    </w:p>
+    <w:p/>
     <w:p>
       <w:pPr>
         <w:pStyle w:val="2"/>
@@ -937,7 +516,117 @@
         <w:spacing w:before="100" w:beforeAutospacing="1" w:after="100" w:afterAutospacing="1" w:line="240" w:lineRule="auto"/>
       </w:pPr>
       <w:r>
-        <w:t xml:space="preserve">фасады? </w:t>
+        <w:t>фасады?</w:t>
+      </w:r>
+    </w:p>
+    <w:p>
+      <w:pPr>
+        <w:numPr>
+          <w:ilvl w:val="1"/>
+          <w:numId w:val="22"/>
+        </w:numPr>
+        <w:spacing w:before="100" w:beforeAutospacing="1" w:after="100" w:afterAutospacing="1" w:line="240" w:lineRule="auto"/>
+        <w:rPr>
+          <w:highlight w:val="yellow"/>
+        </w:rPr>
+      </w:pPr>
+      <w:r>
+        <w:rPr>
+          <w:highlight w:val="yellow"/>
+        </w:rPr>
+        <w:t>Капитальный ремонт</w:t>
+      </w:r>
+    </w:p>
+    <w:p>
+      <w:pPr>
+        <w:numPr>
+          <w:ilvl w:val="1"/>
+          <w:numId w:val="22"/>
+        </w:numPr>
+        <w:spacing w:before="100" w:beforeAutospacing="1" w:after="100" w:afterAutospacing="1" w:line="240" w:lineRule="auto"/>
+        <w:rPr>
+          <w:highlight w:val="yellow"/>
+        </w:rPr>
+      </w:pPr>
+      <w:r>
+        <w:rPr>
+          <w:highlight w:val="yellow"/>
+        </w:rPr>
+        <w:t>Электрика</w:t>
+      </w:r>
+    </w:p>
+    <w:p>
+      <w:pPr>
+        <w:numPr>
+          <w:ilvl w:val="1"/>
+          <w:numId w:val="22"/>
+        </w:numPr>
+        <w:spacing w:before="100" w:beforeAutospacing="1" w:after="100" w:afterAutospacing="1" w:line="240" w:lineRule="auto"/>
+        <w:rPr>
+          <w:highlight w:val="yellow"/>
+        </w:rPr>
+      </w:pPr>
+      <w:r>
+        <w:rPr>
+          <w:highlight w:val="yellow"/>
+        </w:rPr>
+        <w:t>Сантехника</w:t>
+      </w:r>
+    </w:p>
+    <w:p>
+      <w:pPr>
+        <w:numPr>
+          <w:ilvl w:val="1"/>
+          <w:numId w:val="22"/>
+        </w:numPr>
+        <w:spacing w:before="100" w:beforeAutospacing="1" w:after="100" w:afterAutospacing="1" w:line="240" w:lineRule="auto"/>
+        <w:rPr>
+          <w:highlight w:val="yellow"/>
+        </w:rPr>
+      </w:pPr>
+      <w:r>
+        <w:rPr>
+          <w:highlight w:val="yellow"/>
+        </w:rPr>
+        <w:t>Отделочные полностью</w:t>
+      </w:r>
+      <w:r>
+        <w:rPr>
+          <w:highlight w:val="yellow"/>
+        </w:rPr>
+        <w:t xml:space="preserve"> </w:t>
+      </w:r>
+    </w:p>
+    <w:p>
+      <w:pPr>
+        <w:numPr>
+          <w:ilvl w:val="1"/>
+          <w:numId w:val="22"/>
+        </w:numPr>
+        <w:spacing w:before="100" w:beforeAutospacing="1" w:after="100" w:afterAutospacing="1" w:line="240" w:lineRule="auto"/>
+        <w:rPr>
+          <w:highlight w:val="yellow"/>
+        </w:rPr>
+      </w:pPr>
+      <w:r>
+        <w:rPr>
+          <w:highlight w:val="yellow"/>
+        </w:rPr>
+        <w:t xml:space="preserve">НЕ </w:t>
+      </w:r>
+      <w:proofErr w:type="spellStart"/>
+      <w:r>
+        <w:rPr>
+          <w:highlight w:val="yellow"/>
+        </w:rPr>
+        <w:t>промыш</w:t>
+      </w:r>
+      <w:proofErr w:type="spellEnd"/>
+      <w:r>
+        <w:rPr>
+          <w:highlight w:val="yellow"/>
+        </w:rPr>
+        <w:t xml:space="preserve"> объекты не реставрация</w:t>
       </w:r>
     </w:p>
     <w:p>
@@ -1010,6 +699,17 @@
     </w:p>
     <w:p>
       <w:pPr>
+        <w:spacing w:before="100" w:beforeAutospacing="1" w:after="100" w:afterAutospacing="1" w:line="240" w:lineRule="auto"/>
+      </w:pPr>
+      <w:r>
+        <w:rPr>
+          <w:highlight w:val="yellow"/>
+        </w:rPr>
+        <w:t>Уточнит? саморегулирующая организация?</w:t>
+      </w:r>
+    </w:p>
+    <w:p>
+      <w:pPr>
         <w:spacing w:after="0"/>
       </w:pPr>
       <w:r>
@@ -1075,8 +775,14 @@
           <w:numId w:val="24"/>
         </w:numPr>
         <w:spacing w:before="100" w:beforeAutospacing="1" w:after="100" w:afterAutospacing="1" w:line="240" w:lineRule="auto"/>
-      </w:pPr>
-      <w:r>
+        <w:rPr>
+          <w:highlight w:val="yellow"/>
+        </w:rPr>
+      </w:pPr>
+      <w:r>
+        <w:rPr>
+          <w:highlight w:val="yellow"/>
+        </w:rPr>
         <w:t xml:space="preserve">государство </w:t>
       </w:r>
     </w:p>
@@ -1094,6 +800,26 @@
     </w:p>
     <w:p>
       <w:pPr>
+        <w:numPr>
+          <w:ilvl w:val="0"/>
+          <w:numId w:val="24"/>
+        </w:numPr>
+        <w:spacing w:before="100" w:beforeAutospacing="1" w:after="100" w:afterAutospacing="1" w:line="240" w:lineRule="auto"/>
+      </w:pPr>
+      <w:r>
+        <w:t xml:space="preserve">Районная администрация и </w:t>
+      </w:r>
+      <w:proofErr w:type="spellStart"/>
+      <w:r>
+        <w:t>спб</w:t>
+      </w:r>
+      <w:proofErr w:type="spellEnd"/>
+      <w:r>
+        <w:t xml:space="preserve"> и частные</w:t>
+      </w:r>
+    </w:p>
+    <w:p>
+      <w:pPr>
         <w:spacing w:after="0"/>
       </w:pPr>
       <w:r>
@@ -1135,8 +861,14 @@
           <w:numId w:val="25"/>
         </w:numPr>
         <w:spacing w:before="100" w:beforeAutospacing="1" w:after="100" w:afterAutospacing="1" w:line="240" w:lineRule="auto"/>
-      </w:pPr>
-      <w:r>
+        <w:rPr>
+          <w:highlight w:val="yellow"/>
+        </w:rPr>
+      </w:pPr>
+      <w:r>
+        <w:rPr>
+          <w:highlight w:val="yellow"/>
+        </w:rPr>
         <w:t xml:space="preserve">жилые </w:t>
       </w:r>
     </w:p>
@@ -1147,8 +879,14 @@
           <w:numId w:val="25"/>
         </w:numPr>
         <w:spacing w:before="100" w:beforeAutospacing="1" w:after="100" w:afterAutospacing="1" w:line="240" w:lineRule="auto"/>
-      </w:pPr>
-      <w:r>
+        <w:rPr>
+          <w:highlight w:val="yellow"/>
+        </w:rPr>
+      </w:pPr>
+      <w:r>
+        <w:rPr>
+          <w:highlight w:val="yellow"/>
+        </w:rPr>
         <w:t xml:space="preserve">коммерческие </w:t>
       </w:r>
     </w:p>
@@ -1159,8 +897,14 @@
           <w:numId w:val="25"/>
         </w:numPr>
         <w:spacing w:before="100" w:beforeAutospacing="1" w:after="100" w:afterAutospacing="1" w:line="240" w:lineRule="auto"/>
-      </w:pPr>
-      <w:r>
+        <w:rPr>
+          <w:highlight w:val="yellow"/>
+        </w:rPr>
+      </w:pPr>
+      <w:r>
+        <w:rPr>
+          <w:highlight w:val="yellow"/>
+        </w:rPr>
         <w:t xml:space="preserve">исторические </w:t>
       </w:r>
     </w:p>
@@ -1173,7 +917,13 @@
         <w:spacing w:before="100" w:beforeAutospacing="1" w:after="100" w:afterAutospacing="1" w:line="240" w:lineRule="auto"/>
       </w:pPr>
       <w:r>
-        <w:t xml:space="preserve">ОКН или просто старый фонд </w:t>
+        <w:rPr>
+          <w:highlight w:val="yellow"/>
+        </w:rPr>
+        <w:t>ОКН или просто старый фонд</w:t>
+      </w:r>
+      <w:r>
+        <w:t xml:space="preserve"> </w:t>
       </w:r>
     </w:p>
     <w:p>
@@ -1194,6 +944,7 @@
         <w:rPr>
           <w:rFonts w:ascii="Segoe UI Symbol" w:hAnsi="Segoe UI Symbol" w:cs="Segoe UI Symbol"/>
         </w:rPr>
+        <w:lastRenderedPageBreak/>
         <w:t>🔹</w:t>
       </w:r>
       <w:r>
@@ -1242,7 +993,6 @@
         <w:rPr>
           <w:rFonts w:ascii="Segoe UI Symbol" w:hAnsi="Segoe UI Symbol" w:cs="Segoe UI Symbol"/>
         </w:rPr>
-        <w:lastRenderedPageBreak/>
         <w:t>🔹</w:t>
       </w:r>
       <w:r>
@@ -1312,13 +1062,61 @@
       <w:r>
         <w:t xml:space="preserve">Какие страницы отдельно? </w:t>
       </w:r>
-      <w:bookmarkStart w:id="0" w:name="_GoBack"/>
-      <w:bookmarkEnd w:id="0"/>
+    </w:p>
+    <w:p>
+      <w:r>
+        <w:t>- По видам работ</w:t>
+      </w:r>
+    </w:p>
+    <w:p>
+      <w:r>
+        <w:t>- информативные</w:t>
+      </w:r>
     </w:p>
     <w:p/>
     <w:p>
       <w:r>
         <w:t>Где у какого здания что реконструировали.</w:t>
+      </w:r>
+    </w:p>
+    <w:p>
+      <w:r>
+        <w:t>-</w:t>
+      </w:r>
+    </w:p>
+    <w:p/>
+    <w:p>
+      <w:r>
+        <w:t>В какие года проводилась реконструкция</w:t>
+      </w:r>
+    </w:p>
+    <w:p>
+      <w:r>
+        <w:t>Мил. Замена межэтажных Перекрытий, сантехника, капитальный ремонт., электрика. Стояли только стены</w:t>
+      </w:r>
+    </w:p>
+    <w:p/>
+    <w:p>
+      <w:r>
+        <w:t>Фуражный капитальный тоже, демонтаж, черновая отделка, чистовая</w:t>
+      </w:r>
+    </w:p>
+    <w:p>
+      <w:r>
+        <w:t>Жуковский тоже (без замены перекрытий) без расселения. Люди жили, они делали. Очень сложная работа.</w:t>
+      </w:r>
+    </w:p>
+    <w:p>
+      <w:r>
+        <w:t xml:space="preserve">Советская только </w:t>
+      </w:r>
+      <w:proofErr w:type="spellStart"/>
+      <w:r>
+        <w:t>полумансарда</w:t>
+      </w:r>
+      <w:proofErr w:type="spellEnd"/>
+      <w:r>
+        <w:t>, но замена перекрытий (внутри).</w:t>
       </w:r>
     </w:p>
     <w:sectPr>
@@ -3091,6 +2889,95 @@
     </w:lvl>
   </w:abstractNum>
   <w:abstractNum w:abstractNumId="13" w15:restartNumberingAfterBreak="0">
+    <w:nsid w:val="4A4448B9"/>
+    <w:multiLevelType w:val="hybridMultilevel"/>
+    <w:tmpl w:val="06E037D2"/>
+    <w:lvl w:ilvl="0" w:tplc="0419000F">
+      <w:start w:val="1"/>
+      <w:numFmt w:val="decimal"/>
+      <w:lvlText w:val="%1."/>
+      <w:lvlJc w:val="left"/>
+      <w:pPr>
+        <w:ind w:left="720" w:hanging="360"/>
+      </w:pPr>
+      <w:rPr>
+        <w:rFonts w:hint="default"/>
+      </w:rPr>
+    </w:lvl>
+    <w:lvl w:ilvl="1" w:tplc="04190019" w:tentative="1">
+      <w:start w:val="1"/>
+      <w:numFmt w:val="lowerLetter"/>
+      <w:lvlText w:val="%2."/>
+      <w:lvlJc w:val="left"/>
+      <w:pPr>
+        <w:ind w:left="1440" w:hanging="360"/>
+      </w:pPr>
+    </w:lvl>
+    <w:lvl w:ilvl="2" w:tplc="0419001B" w:tentative="1">
+      <w:start w:val="1"/>
+      <w:numFmt w:val="lowerRoman"/>
+      <w:lvlText w:val="%3."/>
+      <w:lvlJc w:val="right"/>
+      <w:pPr>
+        <w:ind w:left="2160" w:hanging="180"/>
+      </w:pPr>
+    </w:lvl>
+    <w:lvl w:ilvl="3" w:tplc="0419000F" w:tentative="1">
+      <w:start w:val="1"/>
+      <w:numFmt w:val="decimal"/>
+      <w:lvlText w:val="%4."/>
+      <w:lvlJc w:val="left"/>
+      <w:pPr>
+        <w:ind w:left="2880" w:hanging="360"/>
+      </w:pPr>
+    </w:lvl>
+    <w:lvl w:ilvl="4" w:tplc="04190019" w:tentative="1">
+      <w:start w:val="1"/>
+      <w:numFmt w:val="lowerLetter"/>
+      <w:lvlText w:val="%5."/>
+      <w:lvlJc w:val="left"/>
+      <w:pPr>
+        <w:ind w:left="3600" w:hanging="360"/>
+      </w:pPr>
+    </w:lvl>
+    <w:lvl w:ilvl="5" w:tplc="0419001B" w:tentative="1">
+      <w:start w:val="1"/>
+      <w:numFmt w:val="lowerRoman"/>
+      <w:lvlText w:val="%6."/>
+      <w:lvlJc w:val="right"/>
+      <w:pPr>
+        <w:ind w:left="4320" w:hanging="180"/>
+      </w:pPr>
+    </w:lvl>
+    <w:lvl w:ilvl="6" w:tplc="0419000F" w:tentative="1">
+      <w:start w:val="1"/>
+      <w:numFmt w:val="decimal"/>
+      <w:lvlText w:val="%7."/>
+      <w:lvlJc w:val="left"/>
+      <w:pPr>
+        <w:ind w:left="5040" w:hanging="360"/>
+      </w:pPr>
+    </w:lvl>
+    <w:lvl w:ilvl="7" w:tplc="04190019" w:tentative="1">
+      <w:start w:val="1"/>
+      <w:numFmt w:val="lowerLetter"/>
+      <w:lvlText w:val="%8."/>
+      <w:lvlJc w:val="left"/>
+      <w:pPr>
+        <w:ind w:left="5760" w:hanging="360"/>
+      </w:pPr>
+    </w:lvl>
+    <w:lvl w:ilvl="8" w:tplc="0419001B" w:tentative="1">
+      <w:start w:val="1"/>
+      <w:numFmt w:val="lowerRoman"/>
+      <w:lvlText w:val="%9."/>
+      <w:lvlJc w:val="right"/>
+      <w:pPr>
+        <w:ind w:left="6480" w:hanging="180"/>
+      </w:pPr>
+    </w:lvl>
+  </w:abstractNum>
+  <w:abstractNum w:abstractNumId="14" w15:restartNumberingAfterBreak="0">
     <w:nsid w:val="4EAC6E55"/>
     <w:multiLevelType w:val="multilevel"/>
     <w:tmpl w:val="1AFC94BC"/>
@@ -3239,7 +3126,7 @@
       </w:rPr>
     </w:lvl>
   </w:abstractNum>
-  <w:abstractNum w:abstractNumId="14" w15:restartNumberingAfterBreak="0">
+  <w:abstractNum w:abstractNumId="15" w15:restartNumberingAfterBreak="0">
     <w:nsid w:val="4EC934B1"/>
     <w:multiLevelType w:val="multilevel"/>
     <w:tmpl w:val="41E2EDD6"/>
@@ -3388,7 +3275,7 @@
       </w:rPr>
     </w:lvl>
   </w:abstractNum>
-  <w:abstractNum w:abstractNumId="15" w15:restartNumberingAfterBreak="0">
+  <w:abstractNum w:abstractNumId="16" w15:restartNumberingAfterBreak="0">
     <w:nsid w:val="51C11953"/>
     <w:multiLevelType w:val="hybridMultilevel"/>
     <w:tmpl w:val="83221C90"/>
@@ -3501,7 +3388,7 @@
       </w:rPr>
     </w:lvl>
   </w:abstractNum>
-  <w:abstractNum w:abstractNumId="16" w15:restartNumberingAfterBreak="0">
+  <w:abstractNum w:abstractNumId="17" w15:restartNumberingAfterBreak="0">
     <w:nsid w:val="51F84B10"/>
     <w:multiLevelType w:val="multilevel"/>
     <w:tmpl w:val="D14272D4"/>
@@ -3650,7 +3537,7 @@
       </w:rPr>
     </w:lvl>
   </w:abstractNum>
-  <w:abstractNum w:abstractNumId="17" w15:restartNumberingAfterBreak="0">
+  <w:abstractNum w:abstractNumId="18" w15:restartNumberingAfterBreak="0">
     <w:nsid w:val="5724457C"/>
     <w:multiLevelType w:val="multilevel"/>
     <w:tmpl w:val="CCA8D32C"/>
@@ -3799,7 +3686,7 @@
       </w:rPr>
     </w:lvl>
   </w:abstractNum>
-  <w:abstractNum w:abstractNumId="18" w15:restartNumberingAfterBreak="0">
+  <w:abstractNum w:abstractNumId="19" w15:restartNumberingAfterBreak="0">
     <w:nsid w:val="5ABD4BCA"/>
     <w:multiLevelType w:val="multilevel"/>
     <w:tmpl w:val="A21A5EFA"/>
@@ -3948,7 +3835,7 @@
       </w:rPr>
     </w:lvl>
   </w:abstractNum>
-  <w:abstractNum w:abstractNumId="19" w15:restartNumberingAfterBreak="0">
+  <w:abstractNum w:abstractNumId="20" w15:restartNumberingAfterBreak="0">
     <w:nsid w:val="6A5338A4"/>
     <w:multiLevelType w:val="multilevel"/>
     <w:tmpl w:val="555C00F8"/>
@@ -4061,7 +3948,7 @@
       </w:pPr>
     </w:lvl>
   </w:abstractNum>
-  <w:abstractNum w:abstractNumId="20" w15:restartNumberingAfterBreak="0">
+  <w:abstractNum w:abstractNumId="21" w15:restartNumberingAfterBreak="0">
     <w:nsid w:val="71297018"/>
     <w:multiLevelType w:val="hybridMultilevel"/>
     <w:tmpl w:val="3F90CCA8"/>
@@ -4174,7 +4061,7 @@
       </w:rPr>
     </w:lvl>
   </w:abstractNum>
-  <w:abstractNum w:abstractNumId="21" w15:restartNumberingAfterBreak="0">
+  <w:abstractNum w:abstractNumId="22" w15:restartNumberingAfterBreak="0">
     <w:nsid w:val="71685FE2"/>
     <w:multiLevelType w:val="hybridMultilevel"/>
     <w:tmpl w:val="118A1B8A"/>
@@ -4287,7 +4174,7 @@
       </w:rPr>
     </w:lvl>
   </w:abstractNum>
-  <w:abstractNum w:abstractNumId="22" w15:restartNumberingAfterBreak="0">
+  <w:abstractNum w:abstractNumId="23" w15:restartNumberingAfterBreak="0">
     <w:nsid w:val="747F7AEC"/>
     <w:multiLevelType w:val="multilevel"/>
     <w:tmpl w:val="0268BC34"/>
@@ -4436,7 +4323,7 @@
       </w:rPr>
     </w:lvl>
   </w:abstractNum>
-  <w:abstractNum w:abstractNumId="23" w15:restartNumberingAfterBreak="0">
+  <w:abstractNum w:abstractNumId="24" w15:restartNumberingAfterBreak="0">
     <w:nsid w:val="78EE1876"/>
     <w:multiLevelType w:val="hybridMultilevel"/>
     <w:tmpl w:val="8E12EC56"/>
@@ -4525,7 +4412,7 @@
       </w:pPr>
     </w:lvl>
   </w:abstractNum>
-  <w:abstractNum w:abstractNumId="24" w15:restartNumberingAfterBreak="0">
+  <w:abstractNum w:abstractNumId="25" w15:restartNumberingAfterBreak="0">
     <w:nsid w:val="78FC301A"/>
     <w:multiLevelType w:val="hybridMultilevel"/>
     <w:tmpl w:val="0DB2E6FA"/>
@@ -4638,7 +4525,7 @@
       </w:rPr>
     </w:lvl>
   </w:abstractNum>
-  <w:abstractNum w:abstractNumId="25" w15:restartNumberingAfterBreak="0">
+  <w:abstractNum w:abstractNumId="26" w15:restartNumberingAfterBreak="0">
     <w:nsid w:val="79EC3138"/>
     <w:multiLevelType w:val="hybridMultilevel"/>
     <w:tmpl w:val="C17066B4"/>
@@ -4727,7 +4614,7 @@
       </w:pPr>
     </w:lvl>
   </w:abstractNum>
-  <w:abstractNum w:abstractNumId="26" w15:restartNumberingAfterBreak="0">
+  <w:abstractNum w:abstractNumId="27" w15:restartNumberingAfterBreak="0">
     <w:nsid w:val="7F884E2A"/>
     <w:multiLevelType w:val="hybridMultilevel"/>
     <w:tmpl w:val="DFA66B70"/>
@@ -4841,10 +4728,10 @@
     </w:lvl>
   </w:abstractNum>
   <w:num w:numId="1">
-    <w:abstractNumId w:val="25"/>
+    <w:abstractNumId w:val="26"/>
   </w:num>
   <w:num w:numId="2">
-    <w:abstractNumId w:val="23"/>
+    <w:abstractNumId w:val="24"/>
   </w:num>
   <w:num w:numId="3">
     <w:abstractNumId w:val="1"/>
@@ -4853,10 +4740,10 @@
     <w:abstractNumId w:val="11"/>
   </w:num>
   <w:num w:numId="5">
-    <w:abstractNumId w:val="26"/>
+    <w:abstractNumId w:val="27"/>
   </w:num>
   <w:num w:numId="6">
-    <w:abstractNumId w:val="18"/>
+    <w:abstractNumId w:val="19"/>
   </w:num>
   <w:num w:numId="7">
     <w:abstractNumId w:val="6"/>
@@ -4877,22 +4764,22 @@
     <w:abstractNumId w:val="4"/>
   </w:num>
   <w:num w:numId="13">
-    <w:abstractNumId w:val="19"/>
+    <w:abstractNumId w:val="20"/>
   </w:num>
   <w:num w:numId="14">
-    <w:abstractNumId w:val="13"/>
+    <w:abstractNumId w:val="14"/>
   </w:num>
   <w:num w:numId="15">
-    <w:abstractNumId w:val="21"/>
+    <w:abstractNumId w:val="22"/>
   </w:num>
   <w:num w:numId="16">
-    <w:abstractNumId w:val="15"/>
+    <w:abstractNumId w:val="16"/>
   </w:num>
   <w:num w:numId="17">
     <w:abstractNumId w:val="3"/>
   </w:num>
   <w:num w:numId="18">
-    <w:abstractNumId w:val="20"/>
+    <w:abstractNumId w:val="21"/>
   </w:num>
   <w:num w:numId="19">
     <w:abstractNumId w:val="10"/>
@@ -4901,7 +4788,7 @@
     <w:abstractNumId w:val="5"/>
   </w:num>
   <w:num w:numId="21">
-    <w:abstractNumId w:val="24"/>
+    <w:abstractNumId w:val="25"/>
   </w:num>
   <w:num w:numId="22">
     <w:abstractNumId w:val="2"/>
@@ -4910,16 +4797,19 @@
     <w:abstractNumId w:val="8"/>
   </w:num>
   <w:num w:numId="24">
+    <w:abstractNumId w:val="18"/>
+  </w:num>
+  <w:num w:numId="25">
+    <w:abstractNumId w:val="23"/>
+  </w:num>
+  <w:num w:numId="26">
+    <w:abstractNumId w:val="15"/>
+  </w:num>
+  <w:num w:numId="27">
     <w:abstractNumId w:val="17"/>
   </w:num>
-  <w:num w:numId="25">
-    <w:abstractNumId w:val="22"/>
-  </w:num>
-  <w:num w:numId="26">
-    <w:abstractNumId w:val="14"/>
-  </w:num>
-  <w:num w:numId="27">
-    <w:abstractNumId w:val="16"/>
+  <w:num w:numId="28">
+    <w:abstractNumId w:val="13"/>
   </w:num>
 </w:numbering>
 </file>

</xml_diff>